<commit_message>
Add system diagnostic and project docs
</commit_message>
<xml_diff>
--- a/docs/word/09_ChatGPT_Project_Handoff_and_Deployment_Playbook.docx
+++ b/docs/word/09_ChatGPT_Project_Handoff_and_Deployment_Playbook.docx
@@ -5,8 +5,7 @@
     <w:p>
       <w:pPr>
         <w:pStyle w:val="Title"/>
-        <w:spacing w:after="220"/>
-        <w:jc w:val="center"/>
+        <w:spacing w:after="120" w:before="180"/>
       </w:pPr>
       <w:r>
         <w:rPr>
@@ -20,13 +19,10 @@
     </w:p>
     <w:p>
       <w:pPr>
-        <w:spacing w:after="360"/>
-        <w:jc w:val="center"/>
-      </w:pPr>
-      <w:r>
-        <w:rPr>
-          <w:i/>
-          <w:iCs/>
+        <w:spacing w:after="120"/>
+      </w:pPr>
+      <w:r>
+        <w:rPr>
           <w:sz w:val="22"/>
           <w:szCs w:val="22"/>
         </w:rPr>
@@ -36,7 +32,7 @@
     <w:p>
       <w:pPr>
         <w:pStyle w:val="Heading1"/>
-        <w:spacing w:after="120" w:before="160"/>
+        <w:spacing w:after="120" w:before="180"/>
       </w:pPr>
       <w:r>
         <w:rPr>
@@ -50,7 +46,7 @@
     </w:p>
     <w:p>
       <w:pPr>
-        <w:spacing w:after="160"/>
+        <w:spacing w:after="120"/>
       </w:pPr>
       <w:r>
         <w:rPr>
@@ -62,7 +58,7 @@
     </w:p>
     <w:p>
       <w:pPr>
-        <w:spacing w:after="160"/>
+        <w:spacing w:after="120"/>
       </w:pPr>
       <w:r>
         <w:rPr>
@@ -75,7 +71,7 @@
     <w:p>
       <w:pPr>
         <w:pStyle w:val="Heading1"/>
-        <w:spacing w:after="120" w:before="160"/>
+        <w:spacing w:after="120" w:before="180"/>
       </w:pPr>
       <w:r>
         <w:rPr>
@@ -94,7 +90,7 @@
           <w:ilvl w:val="0"/>
           <w:numId w:val="1"/>
         </w:numPr>
-        <w:spacing w:after="100"/>
+        <w:spacing w:after="80"/>
       </w:pPr>
       <w:r>
         <w:rPr>
@@ -111,7 +107,7 @@
           <w:ilvl w:val="0"/>
           <w:numId w:val="1"/>
         </w:numPr>
-        <w:spacing w:after="100"/>
+        <w:spacing w:after="80"/>
       </w:pPr>
       <w:r>
         <w:rPr>
@@ -128,7 +124,7 @@
           <w:ilvl w:val="0"/>
           <w:numId w:val="1"/>
         </w:numPr>
-        <w:spacing w:after="100"/>
+        <w:spacing w:after="80"/>
       </w:pPr>
       <w:r>
         <w:rPr>
@@ -145,7 +141,7 @@
           <w:ilvl w:val="0"/>
           <w:numId w:val="1"/>
         </w:numPr>
-        <w:spacing w:after="100"/>
+        <w:spacing w:after="80"/>
       </w:pPr>
       <w:r>
         <w:rPr>
@@ -162,7 +158,7 @@
           <w:ilvl w:val="0"/>
           <w:numId w:val="1"/>
         </w:numPr>
-        <w:spacing w:after="100"/>
+        <w:spacing w:after="80"/>
       </w:pPr>
       <w:r>
         <w:rPr>
@@ -179,7 +175,7 @@
           <w:ilvl w:val="0"/>
           <w:numId w:val="1"/>
         </w:numPr>
-        <w:spacing w:after="100"/>
+        <w:spacing w:after="80"/>
       </w:pPr>
       <w:r>
         <w:rPr>
@@ -196,7 +192,7 @@
           <w:ilvl w:val="0"/>
           <w:numId w:val="1"/>
         </w:numPr>
-        <w:spacing w:after="100"/>
+        <w:spacing w:after="80"/>
       </w:pPr>
       <w:r>
         <w:rPr>
@@ -213,7 +209,7 @@
           <w:ilvl w:val="0"/>
           <w:numId w:val="1"/>
         </w:numPr>
-        <w:spacing w:after="100"/>
+        <w:spacing w:after="80"/>
       </w:pPr>
       <w:r>
         <w:rPr>
@@ -230,7 +226,7 @@
           <w:ilvl w:val="0"/>
           <w:numId w:val="1"/>
         </w:numPr>
-        <w:spacing w:after="100"/>
+        <w:spacing w:after="80"/>
       </w:pPr>
       <w:r>
         <w:rPr>
@@ -243,7 +239,7 @@
     <w:p>
       <w:pPr>
         <w:pStyle w:val="Heading1"/>
-        <w:spacing w:after="120" w:before="160"/>
+        <w:spacing w:after="120" w:before="180"/>
       </w:pPr>
       <w:r>
         <w:rPr>
@@ -262,7 +258,7 @@
           <w:ilvl w:val="0"/>
           <w:numId w:val="1"/>
         </w:numPr>
-        <w:spacing w:after="100"/>
+        <w:spacing w:after="80"/>
       </w:pPr>
       <w:r>
         <w:rPr>
@@ -279,7 +275,7 @@
           <w:ilvl w:val="0"/>
           <w:numId w:val="1"/>
         </w:numPr>
-        <w:spacing w:after="100"/>
+        <w:spacing w:after="80"/>
       </w:pPr>
       <w:r>
         <w:rPr>
@@ -296,7 +292,7 @@
           <w:ilvl w:val="0"/>
           <w:numId w:val="1"/>
         </w:numPr>
-        <w:spacing w:after="100"/>
+        <w:spacing w:after="80"/>
       </w:pPr>
       <w:r>
         <w:rPr>
@@ -313,7 +309,7 @@
           <w:ilvl w:val="0"/>
           <w:numId w:val="1"/>
         </w:numPr>
-        <w:spacing w:after="100"/>
+        <w:spacing w:after="80"/>
       </w:pPr>
       <w:r>
         <w:rPr>
@@ -330,7 +326,7 @@
           <w:ilvl w:val="0"/>
           <w:numId w:val="1"/>
         </w:numPr>
-        <w:spacing w:after="100"/>
+        <w:spacing w:after="80"/>
       </w:pPr>
       <w:r>
         <w:rPr>
@@ -347,7 +343,7 @@
           <w:ilvl w:val="0"/>
           <w:numId w:val="1"/>
         </w:numPr>
-        <w:spacing w:after="100"/>
+        <w:spacing w:after="80"/>
       </w:pPr>
       <w:r>
         <w:rPr>
@@ -364,7 +360,7 @@
           <w:ilvl w:val="0"/>
           <w:numId w:val="1"/>
         </w:numPr>
-        <w:spacing w:after="100"/>
+        <w:spacing w:after="80"/>
       </w:pPr>
       <w:r>
         <w:rPr>
@@ -381,7 +377,7 @@
           <w:ilvl w:val="0"/>
           <w:numId w:val="1"/>
         </w:numPr>
-        <w:spacing w:after="100"/>
+        <w:spacing w:after="80"/>
       </w:pPr>
       <w:r>
         <w:rPr>
@@ -398,7 +394,7 @@
           <w:ilvl w:val="0"/>
           <w:numId w:val="1"/>
         </w:numPr>
-        <w:spacing w:after="100"/>
+        <w:spacing w:after="80"/>
       </w:pPr>
       <w:r>
         <w:rPr>
@@ -415,7 +411,7 @@
           <w:ilvl w:val="0"/>
           <w:numId w:val="1"/>
         </w:numPr>
-        <w:spacing w:after="100"/>
+        <w:spacing w:after="80"/>
       </w:pPr>
       <w:r>
         <w:rPr>
@@ -432,7 +428,7 @@
           <w:ilvl w:val="0"/>
           <w:numId w:val="1"/>
         </w:numPr>
-        <w:spacing w:after="100"/>
+        <w:spacing w:after="80"/>
       </w:pPr>
       <w:r>
         <w:rPr>
@@ -449,7 +445,7 @@
           <w:ilvl w:val="0"/>
           <w:numId w:val="1"/>
         </w:numPr>
-        <w:spacing w:after="100"/>
+        <w:spacing w:after="80"/>
       </w:pPr>
       <w:r>
         <w:rPr>
@@ -466,7 +462,7 @@
           <w:ilvl w:val="0"/>
           <w:numId w:val="1"/>
         </w:numPr>
-        <w:spacing w:after="100"/>
+        <w:spacing w:after="80"/>
       </w:pPr>
       <w:r>
         <w:rPr>
@@ -483,7 +479,7 @@
           <w:ilvl w:val="0"/>
           <w:numId w:val="1"/>
         </w:numPr>
-        <w:spacing w:after="100"/>
+        <w:spacing w:after="80"/>
       </w:pPr>
       <w:r>
         <w:rPr>
@@ -500,7 +496,7 @@
           <w:ilvl w:val="0"/>
           <w:numId w:val="1"/>
         </w:numPr>
-        <w:spacing w:after="100"/>
+        <w:spacing w:after="80"/>
       </w:pPr>
       <w:r>
         <w:rPr>
@@ -517,7 +513,7 @@
           <w:ilvl w:val="0"/>
           <w:numId w:val="1"/>
         </w:numPr>
-        <w:spacing w:after="100"/>
+        <w:spacing w:after="80"/>
       </w:pPr>
       <w:r>
         <w:rPr>
@@ -534,7 +530,7 @@
           <w:ilvl w:val="0"/>
           <w:numId w:val="1"/>
         </w:numPr>
-        <w:spacing w:after="100"/>
+        <w:spacing w:after="80"/>
       </w:pPr>
       <w:r>
         <w:rPr>
@@ -551,7 +547,7 @@
           <w:ilvl w:val="0"/>
           <w:numId w:val="1"/>
         </w:numPr>
-        <w:spacing w:after="100"/>
+        <w:spacing w:after="80"/>
       </w:pPr>
       <w:r>
         <w:rPr>
@@ -564,7 +560,7 @@
     <w:p>
       <w:pPr>
         <w:pStyle w:val="Heading1"/>
-        <w:spacing w:after="120" w:before="160"/>
+        <w:spacing w:after="120" w:before="180"/>
       </w:pPr>
       <w:r>
         <w:rPr>
@@ -583,7 +579,7 @@
           <w:ilvl w:val="0"/>
           <w:numId w:val="1"/>
         </w:numPr>
-        <w:spacing w:after="100"/>
+        <w:spacing w:after="80"/>
       </w:pPr>
       <w:r>
         <w:rPr>
@@ -600,7 +596,7 @@
           <w:ilvl w:val="0"/>
           <w:numId w:val="1"/>
         </w:numPr>
-        <w:spacing w:after="100"/>
+        <w:spacing w:after="80"/>
       </w:pPr>
       <w:r>
         <w:rPr>
@@ -617,7 +613,7 @@
           <w:ilvl w:val="0"/>
           <w:numId w:val="1"/>
         </w:numPr>
-        <w:spacing w:after="100"/>
+        <w:spacing w:after="80"/>
       </w:pPr>
       <w:r>
         <w:rPr>
@@ -634,7 +630,7 @@
           <w:ilvl w:val="0"/>
           <w:numId w:val="1"/>
         </w:numPr>
-        <w:spacing w:after="100"/>
+        <w:spacing w:after="80"/>
       </w:pPr>
       <w:r>
         <w:rPr>
@@ -651,7 +647,7 @@
           <w:ilvl w:val="0"/>
           <w:numId w:val="1"/>
         </w:numPr>
-        <w:spacing w:after="100"/>
+        <w:spacing w:after="80"/>
       </w:pPr>
       <w:r>
         <w:rPr>
@@ -668,7 +664,7 @@
           <w:ilvl w:val="0"/>
           <w:numId w:val="1"/>
         </w:numPr>
-        <w:spacing w:after="100"/>
+        <w:spacing w:after="80"/>
       </w:pPr>
       <w:r>
         <w:rPr>
@@ -685,7 +681,7 @@
           <w:ilvl w:val="0"/>
           <w:numId w:val="1"/>
         </w:numPr>
-        <w:spacing w:after="100"/>
+        <w:spacing w:after="80"/>
       </w:pPr>
       <w:r>
         <w:rPr>
@@ -702,7 +698,7 @@
           <w:ilvl w:val="0"/>
           <w:numId w:val="1"/>
         </w:numPr>
-        <w:spacing w:after="100"/>
+        <w:spacing w:after="80"/>
       </w:pPr>
       <w:r>
         <w:rPr>
@@ -719,7 +715,7 @@
           <w:ilvl w:val="0"/>
           <w:numId w:val="1"/>
         </w:numPr>
-        <w:spacing w:after="100"/>
+        <w:spacing w:after="80"/>
       </w:pPr>
       <w:r>
         <w:rPr>
@@ -736,7 +732,7 @@
           <w:ilvl w:val="0"/>
           <w:numId w:val="1"/>
         </w:numPr>
-        <w:spacing w:after="100"/>
+        <w:spacing w:after="80"/>
       </w:pPr>
       <w:r>
         <w:rPr>
@@ -753,7 +749,7 @@
           <w:ilvl w:val="0"/>
           <w:numId w:val="1"/>
         </w:numPr>
-        <w:spacing w:after="100"/>
+        <w:spacing w:after="80"/>
       </w:pPr>
       <w:r>
         <w:rPr>
@@ -770,7 +766,7 @@
           <w:ilvl w:val="0"/>
           <w:numId w:val="1"/>
         </w:numPr>
-        <w:spacing w:after="100"/>
+        <w:spacing w:after="80"/>
       </w:pPr>
       <w:r>
         <w:rPr>
@@ -787,7 +783,7 @@
           <w:ilvl w:val="0"/>
           <w:numId w:val="1"/>
         </w:numPr>
-        <w:spacing w:after="100"/>
+        <w:spacing w:after="80"/>
       </w:pPr>
       <w:r>
         <w:rPr>
@@ -804,7 +800,7 @@
           <w:ilvl w:val="0"/>
           <w:numId w:val="1"/>
         </w:numPr>
-        <w:spacing w:after="100"/>
+        <w:spacing w:after="80"/>
       </w:pPr>
       <w:r>
         <w:rPr>
@@ -821,7 +817,7 @@
           <w:ilvl w:val="0"/>
           <w:numId w:val="1"/>
         </w:numPr>
-        <w:spacing w:after="100"/>
+        <w:spacing w:after="80"/>
       </w:pPr>
       <w:r>
         <w:rPr>
@@ -838,7 +834,7 @@
           <w:ilvl w:val="0"/>
           <w:numId w:val="1"/>
         </w:numPr>
-        <w:spacing w:after="100"/>
+        <w:spacing w:after="80"/>
       </w:pPr>
       <w:r>
         <w:rPr>
@@ -851,7 +847,7 @@
     <w:p>
       <w:pPr>
         <w:pStyle w:val="Heading1"/>
-        <w:spacing w:after="120" w:before="160"/>
+        <w:spacing w:after="120" w:before="180"/>
       </w:pPr>
       <w:r>
         <w:rPr>
@@ -865,91 +861,91 @@
     </w:p>
     <w:p>
       <w:pPr>
-        <w:spacing w:after="80"/>
+        <w:spacing w:after="60"/>
       </w:pPr>
       <w:r>
         <w:rPr>
           <w:rFonts w:ascii="Consolas" w:cs="Consolas" w:eastAsia="Consolas" w:hAnsi="Consolas"/>
-          <w:sz w:val="20"/>
-          <w:szCs w:val="20"/>
+          <w:sz w:val="19"/>
+          <w:szCs w:val="19"/>
         </w:rPr>
         <w:t xml:space="preserve">npm.cmd install</w:t>
       </w:r>
     </w:p>
     <w:p>
       <w:pPr>
-        <w:spacing w:after="80"/>
+        <w:spacing w:after="60"/>
       </w:pPr>
       <w:r>
         <w:rPr>
           <w:rFonts w:ascii="Consolas" w:cs="Consolas" w:eastAsia="Consolas" w:hAnsi="Consolas"/>
-          <w:sz w:val="20"/>
-          <w:szCs w:val="20"/>
+          <w:sz w:val="19"/>
+          <w:szCs w:val="19"/>
         </w:rPr>
         <w:t xml:space="preserve">npm.cmd run setup:demo</w:t>
       </w:r>
     </w:p>
     <w:p>
       <w:pPr>
-        <w:spacing w:after="80"/>
+        <w:spacing w:after="60"/>
       </w:pPr>
       <w:r>
         <w:rPr>
           <w:rFonts w:ascii="Consolas" w:cs="Consolas" w:eastAsia="Consolas" w:hAnsi="Consolas"/>
-          <w:sz w:val="20"/>
-          <w:szCs w:val="20"/>
+          <w:sz w:val="19"/>
+          <w:szCs w:val="19"/>
         </w:rPr>
         <w:t xml:space="preserve">npm.cmd run dev</w:t>
       </w:r>
     </w:p>
     <w:p>
       <w:pPr>
-        <w:spacing w:after="80"/>
+        <w:spacing w:after="60"/>
       </w:pPr>
       <w:r>
         <w:rPr>
           <w:rFonts w:ascii="Consolas" w:cs="Consolas" w:eastAsia="Consolas" w:hAnsi="Consolas"/>
-          <w:sz w:val="20"/>
-          <w:szCs w:val="20"/>
+          <w:sz w:val="19"/>
+          <w:szCs w:val="19"/>
         </w:rPr>
         <w:t xml:space="preserve">npm.cmd run lint</w:t>
       </w:r>
     </w:p>
     <w:p>
       <w:pPr>
-        <w:spacing w:after="80"/>
+        <w:spacing w:after="60"/>
       </w:pPr>
       <w:r>
         <w:rPr>
           <w:rFonts w:ascii="Consolas" w:cs="Consolas" w:eastAsia="Consolas" w:hAnsi="Consolas"/>
-          <w:sz w:val="20"/>
-          <w:szCs w:val="20"/>
+          <w:sz w:val="19"/>
+          <w:szCs w:val="19"/>
         </w:rPr>
         <w:t xml:space="preserve">npm.cmd run test</w:t>
       </w:r>
     </w:p>
     <w:p>
       <w:pPr>
-        <w:spacing w:after="80"/>
+        <w:spacing w:after="60"/>
       </w:pPr>
       <w:r>
         <w:rPr>
           <w:rFonts w:ascii="Consolas" w:cs="Consolas" w:eastAsia="Consolas" w:hAnsi="Consolas"/>
-          <w:sz w:val="20"/>
-          <w:szCs w:val="20"/>
+          <w:sz w:val="19"/>
+          <w:szCs w:val="19"/>
         </w:rPr>
         <w:t xml:space="preserve">npm.cmd run build</w:t>
       </w:r>
     </w:p>
     <w:p>
       <w:pPr>
-        <w:spacing w:after="80"/>
+        <w:spacing w:after="60"/>
       </w:pPr>
       <w:r>
         <w:rPr>
           <w:rFonts w:ascii="Consolas" w:cs="Consolas" w:eastAsia="Consolas" w:hAnsi="Consolas"/>
-          <w:sz w:val="20"/>
-          <w:szCs w:val="20"/>
+          <w:sz w:val="19"/>
+          <w:szCs w:val="19"/>
         </w:rPr>
         <w:t xml:space="preserve">npm.cmd run docs:generate</w:t>
       </w:r>
@@ -957,7 +953,7 @@
     <w:p>
       <w:pPr>
         <w:pStyle w:val="Heading1"/>
-        <w:spacing w:after="120" w:before="160"/>
+        <w:spacing w:after="120" w:before="180"/>
       </w:pPr>
       <w:r>
         <w:rPr>
@@ -976,7 +972,7 @@
           <w:ilvl w:val="0"/>
           <w:numId w:val="1"/>
         </w:numPr>
-        <w:spacing w:after="100"/>
+        <w:spacing w:after="80"/>
       </w:pPr>
       <w:r>
         <w:rPr>
@@ -993,7 +989,7 @@
           <w:ilvl w:val="0"/>
           <w:numId w:val="1"/>
         </w:numPr>
-        <w:spacing w:after="100"/>
+        <w:spacing w:after="80"/>
       </w:pPr>
       <w:r>
         <w:rPr>
@@ -1010,7 +1006,7 @@
           <w:ilvl w:val="0"/>
           <w:numId w:val="1"/>
         </w:numPr>
-        <w:spacing w:after="100"/>
+        <w:spacing w:after="80"/>
       </w:pPr>
       <w:r>
         <w:rPr>
@@ -1027,7 +1023,7 @@
           <w:ilvl w:val="0"/>
           <w:numId w:val="1"/>
         </w:numPr>
-        <w:spacing w:after="100"/>
+        <w:spacing w:after="80"/>
       </w:pPr>
       <w:r>
         <w:rPr>
@@ -1044,7 +1040,7 @@
           <w:ilvl w:val="0"/>
           <w:numId w:val="1"/>
         </w:numPr>
-        <w:spacing w:after="100"/>
+        <w:spacing w:after="80"/>
       </w:pPr>
       <w:r>
         <w:rPr>
@@ -1061,7 +1057,7 @@
           <w:ilvl w:val="0"/>
           <w:numId w:val="1"/>
         </w:numPr>
-        <w:spacing w:after="100"/>
+        <w:spacing w:after="80"/>
       </w:pPr>
       <w:r>
         <w:rPr>
@@ -1078,7 +1074,7 @@
           <w:ilvl w:val="0"/>
           <w:numId w:val="1"/>
         </w:numPr>
-        <w:spacing w:after="100"/>
+        <w:spacing w:after="80"/>
       </w:pPr>
       <w:r>
         <w:rPr>
@@ -1095,7 +1091,7 @@
           <w:ilvl w:val="0"/>
           <w:numId w:val="1"/>
         </w:numPr>
-        <w:spacing w:after="100"/>
+        <w:spacing w:after="80"/>
       </w:pPr>
       <w:r>
         <w:rPr>
@@ -1108,7 +1104,7 @@
     <w:p>
       <w:pPr>
         <w:pStyle w:val="Heading1"/>
-        <w:spacing w:after="120" w:before="160"/>
+        <w:spacing w:after="120" w:before="180"/>
       </w:pPr>
       <w:r>
         <w:rPr>
@@ -1122,7 +1118,7 @@
     </w:p>
     <w:p>
       <w:pPr>
-        <w:spacing w:after="160"/>
+        <w:spacing w:after="120"/>
       </w:pPr>
       <w:r>
         <w:rPr>
@@ -1134,7 +1130,7 @@
     </w:p>
     <w:p>
       <w:pPr>
-        <w:spacing w:after="160"/>
+        <w:spacing w:after="120"/>
       </w:pPr>
       <w:r>
         <w:rPr>
@@ -1146,7 +1142,7 @@
     </w:p>
     <w:p>
       <w:pPr>
-        <w:spacing w:after="160"/>
+        <w:spacing w:after="120"/>
       </w:pPr>
       <w:r>
         <w:rPr>
@@ -1159,7 +1155,7 @@
     <w:p>
       <w:pPr>
         <w:pStyle w:val="Heading1"/>
-        <w:spacing w:after="120" w:before="160"/>
+        <w:spacing w:after="120" w:before="180"/>
       </w:pPr>
       <w:r>
         <w:rPr>
@@ -1178,7 +1174,7 @@
           <w:ilvl w:val="0"/>
           <w:numId w:val="1"/>
         </w:numPr>
-        <w:spacing w:after="100"/>
+        <w:spacing w:after="80"/>
       </w:pPr>
       <w:r>
         <w:rPr>
@@ -1195,7 +1191,7 @@
           <w:ilvl w:val="0"/>
           <w:numId w:val="1"/>
         </w:numPr>
-        <w:spacing w:after="100"/>
+        <w:spacing w:after="80"/>
       </w:pPr>
       <w:r>
         <w:rPr>
@@ -1212,7 +1208,7 @@
           <w:ilvl w:val="0"/>
           <w:numId w:val="1"/>
         </w:numPr>
-        <w:spacing w:after="100"/>
+        <w:spacing w:after="80"/>
       </w:pPr>
       <w:r>
         <w:rPr>
@@ -1229,7 +1225,7 @@
           <w:ilvl w:val="0"/>
           <w:numId w:val="1"/>
         </w:numPr>
-        <w:spacing w:after="100"/>
+        <w:spacing w:after="80"/>
       </w:pPr>
       <w:r>
         <w:rPr>
@@ -1246,7 +1242,7 @@
           <w:ilvl w:val="0"/>
           <w:numId w:val="1"/>
         </w:numPr>
-        <w:spacing w:after="100"/>
+        <w:spacing w:after="80"/>
       </w:pPr>
       <w:r>
         <w:rPr>
@@ -1263,7 +1259,7 @@
           <w:ilvl w:val="0"/>
           <w:numId w:val="1"/>
         </w:numPr>
-        <w:spacing w:after="100"/>
+        <w:spacing w:after="80"/>
       </w:pPr>
       <w:r>
         <w:rPr>
@@ -1280,7 +1276,7 @@
           <w:ilvl w:val="0"/>
           <w:numId w:val="1"/>
         </w:numPr>
-        <w:spacing w:after="100"/>
+        <w:spacing w:after="80"/>
       </w:pPr>
       <w:r>
         <w:rPr>
@@ -1297,7 +1293,7 @@
           <w:ilvl w:val="0"/>
           <w:numId w:val="1"/>
         </w:numPr>
-        <w:spacing w:after="100"/>
+        <w:spacing w:after="80"/>
       </w:pPr>
       <w:r>
         <w:rPr>
@@ -1310,7 +1306,7 @@
     <w:p>
       <w:pPr>
         <w:pStyle w:val="Heading1"/>
-        <w:spacing w:after="120" w:before="160"/>
+        <w:spacing w:after="120" w:before="180"/>
       </w:pPr>
       <w:r>
         <w:rPr>
@@ -1324,7 +1320,7 @@
     </w:p>
     <w:p>
       <w:pPr>
-        <w:spacing w:after="160"/>
+        <w:spacing w:after="120"/>
       </w:pPr>
       <w:r>
         <w:rPr>
@@ -1336,91 +1332,91 @@
     </w:p>
     <w:p>
       <w:pPr>
-        <w:spacing w:after="80"/>
+        <w:spacing w:after="60"/>
       </w:pPr>
       <w:r>
         <w:rPr>
           <w:rFonts w:ascii="Consolas" w:cs="Consolas" w:eastAsia="Consolas" w:hAnsi="Consolas"/>
-          <w:sz w:val="20"/>
-          <w:szCs w:val="20"/>
+          <w:sz w:val="19"/>
+          <w:szCs w:val="19"/>
         </w:rPr>
         <w:t xml:space="preserve">cd C:\Users\DDK\Documents\Jersey\sports-shop-platform-github-ready</w:t>
       </w:r>
     </w:p>
     <w:p>
       <w:pPr>
-        <w:spacing w:after="80"/>
+        <w:spacing w:after="60"/>
       </w:pPr>
       <w:r>
         <w:rPr>
           <w:rFonts w:ascii="Consolas" w:cs="Consolas" w:eastAsia="Consolas" w:hAnsi="Consolas"/>
-          <w:sz w:val="20"/>
-          <w:szCs w:val="20"/>
+          <w:sz w:val="19"/>
+          <w:szCs w:val="19"/>
         </w:rPr>
         <w:t xml:space="preserve">git init</w:t>
       </w:r>
     </w:p>
     <w:p>
       <w:pPr>
-        <w:spacing w:after="80"/>
+        <w:spacing w:after="60"/>
       </w:pPr>
       <w:r>
         <w:rPr>
           <w:rFonts w:ascii="Consolas" w:cs="Consolas" w:eastAsia="Consolas" w:hAnsi="Consolas"/>
-          <w:sz w:val="20"/>
-          <w:szCs w:val="20"/>
+          <w:sz w:val="19"/>
+          <w:szCs w:val="19"/>
         </w:rPr>
         <w:t xml:space="preserve">git add .</w:t>
       </w:r>
     </w:p>
     <w:p>
       <w:pPr>
-        <w:spacing w:after="80"/>
+        <w:spacing w:after="60"/>
       </w:pPr>
       <w:r>
         <w:rPr>
           <w:rFonts w:ascii="Consolas" w:cs="Consolas" w:eastAsia="Consolas" w:hAnsi="Consolas"/>
-          <w:sz w:val="20"/>
-          <w:szCs w:val="20"/>
+          <w:sz w:val="19"/>
+          <w:szCs w:val="19"/>
         </w:rPr>
         <w:t xml:space="preserve">git commit -m "Initial Sports Shop Platform build"</w:t>
       </w:r>
     </w:p>
     <w:p>
       <w:pPr>
-        <w:spacing w:after="80"/>
+        <w:spacing w:after="60"/>
       </w:pPr>
       <w:r>
         <w:rPr>
           <w:rFonts w:ascii="Consolas" w:cs="Consolas" w:eastAsia="Consolas" w:hAnsi="Consolas"/>
-          <w:sz w:val="20"/>
-          <w:szCs w:val="20"/>
+          <w:sz w:val="19"/>
+          <w:szCs w:val="19"/>
         </w:rPr>
         <w:t xml:space="preserve">git branch -M main</w:t>
       </w:r>
     </w:p>
     <w:p>
       <w:pPr>
-        <w:spacing w:after="80"/>
+        <w:spacing w:after="60"/>
       </w:pPr>
       <w:r>
         <w:rPr>
           <w:rFonts w:ascii="Consolas" w:cs="Consolas" w:eastAsia="Consolas" w:hAnsi="Consolas"/>
-          <w:sz w:val="20"/>
-          <w:szCs w:val="20"/>
+          <w:sz w:val="19"/>
+          <w:szCs w:val="19"/>
         </w:rPr>
         <w:t xml:space="preserve">git remote add origin https://github.com/YOUR-USERNAME/sports-shop-platform-github-ready.git</w:t>
       </w:r>
     </w:p>
     <w:p>
       <w:pPr>
-        <w:spacing w:after="80"/>
+        <w:spacing w:after="60"/>
       </w:pPr>
       <w:r>
         <w:rPr>
           <w:rFonts w:ascii="Consolas" w:cs="Consolas" w:eastAsia="Consolas" w:hAnsi="Consolas"/>
-          <w:sz w:val="20"/>
-          <w:szCs w:val="20"/>
+          <w:sz w:val="19"/>
+          <w:szCs w:val="19"/>
         </w:rPr>
         <w:t xml:space="preserve">git push -u origin main</w:t>
       </w:r>
@@ -1428,7 +1424,7 @@
     <w:p>
       <w:pPr>
         <w:pStyle w:val="Heading1"/>
-        <w:spacing w:after="120" w:before="160"/>
+        <w:spacing w:after="120" w:before="180"/>
       </w:pPr>
       <w:r>
         <w:rPr>
@@ -1447,7 +1443,7 @@
           <w:ilvl w:val="0"/>
           <w:numId w:val="1"/>
         </w:numPr>
-        <w:spacing w:after="100"/>
+        <w:spacing w:after="80"/>
       </w:pPr>
       <w:r>
         <w:rPr>
@@ -1464,7 +1460,7 @@
           <w:ilvl w:val="0"/>
           <w:numId w:val="1"/>
         </w:numPr>
-        <w:spacing w:after="100"/>
+        <w:spacing w:after="80"/>
       </w:pPr>
       <w:r>
         <w:rPr>
@@ -1481,7 +1477,7 @@
           <w:ilvl w:val="0"/>
           <w:numId w:val="1"/>
         </w:numPr>
-        <w:spacing w:after="100"/>
+        <w:spacing w:after="80"/>
       </w:pPr>
       <w:r>
         <w:rPr>
@@ -1498,7 +1494,7 @@
           <w:ilvl w:val="0"/>
           <w:numId w:val="1"/>
         </w:numPr>
-        <w:spacing w:after="100"/>
+        <w:spacing w:after="80"/>
       </w:pPr>
       <w:r>
         <w:rPr>
@@ -1515,7 +1511,7 @@
           <w:ilvl w:val="0"/>
           <w:numId w:val="1"/>
         </w:numPr>
-        <w:spacing w:after="100"/>
+        <w:spacing w:after="80"/>
       </w:pPr>
       <w:r>
         <w:rPr>
@@ -1532,7 +1528,7 @@
           <w:ilvl w:val="0"/>
           <w:numId w:val="1"/>
         </w:numPr>
-        <w:spacing w:after="100"/>
+        <w:spacing w:after="80"/>
       </w:pPr>
       <w:r>
         <w:rPr>
@@ -1549,7 +1545,7 @@
           <w:ilvl w:val="0"/>
           <w:numId w:val="1"/>
         </w:numPr>
-        <w:spacing w:after="100"/>
+        <w:spacing w:after="80"/>
       </w:pPr>
       <w:r>
         <w:rPr>
@@ -1566,7 +1562,7 @@
           <w:ilvl w:val="0"/>
           <w:numId w:val="1"/>
         </w:numPr>
-        <w:spacing w:after="100"/>
+        <w:spacing w:after="80"/>
       </w:pPr>
       <w:r>
         <w:rPr>
@@ -1579,7 +1575,7 @@
     <w:p>
       <w:pPr>
         <w:pStyle w:val="Heading1"/>
-        <w:spacing w:after="120" w:before="160"/>
+        <w:spacing w:after="120" w:before="180"/>
       </w:pPr>
       <w:r>
         <w:rPr>
@@ -1598,7 +1594,7 @@
           <w:ilvl w:val="0"/>
           <w:numId w:val="1"/>
         </w:numPr>
-        <w:spacing w:after="100"/>
+        <w:spacing w:after="80"/>
       </w:pPr>
       <w:r>
         <w:rPr>
@@ -1615,7 +1611,7 @@
           <w:ilvl w:val="0"/>
           <w:numId w:val="1"/>
         </w:numPr>
-        <w:spacing w:after="100"/>
+        <w:spacing w:after="80"/>
       </w:pPr>
       <w:r>
         <w:rPr>
@@ -1632,7 +1628,7 @@
           <w:ilvl w:val="0"/>
           <w:numId w:val="1"/>
         </w:numPr>
-        <w:spacing w:after="100"/>
+        <w:spacing w:after="80"/>
       </w:pPr>
       <w:r>
         <w:rPr>
@@ -1645,7 +1641,7 @@
     <w:p>
       <w:pPr>
         <w:pStyle w:val="Heading1"/>
-        <w:spacing w:after="120" w:before="160"/>
+        <w:spacing w:after="120" w:before="180"/>
       </w:pPr>
       <w:r>
         <w:rPr>
@@ -1664,7 +1660,7 @@
           <w:ilvl w:val="0"/>
           <w:numId w:val="1"/>
         </w:numPr>
-        <w:spacing w:after="100"/>
+        <w:spacing w:after="80"/>
       </w:pPr>
       <w:r>
         <w:rPr>
@@ -1681,7 +1677,7 @@
           <w:ilvl w:val="0"/>
           <w:numId w:val="1"/>
         </w:numPr>
-        <w:spacing w:after="100"/>
+        <w:spacing w:after="80"/>
       </w:pPr>
       <w:r>
         <w:rPr>
@@ -1698,7 +1694,7 @@
           <w:ilvl w:val="0"/>
           <w:numId w:val="1"/>
         </w:numPr>
-        <w:spacing w:after="100"/>
+        <w:spacing w:after="80"/>
       </w:pPr>
       <w:r>
         <w:rPr>
@@ -1715,7 +1711,7 @@
           <w:ilvl w:val="0"/>
           <w:numId w:val="1"/>
         </w:numPr>
-        <w:spacing w:after="100"/>
+        <w:spacing w:after="80"/>
       </w:pPr>
       <w:r>
         <w:rPr>
@@ -1732,7 +1728,7 @@
           <w:ilvl w:val="0"/>
           <w:numId w:val="1"/>
         </w:numPr>
-        <w:spacing w:after="100"/>
+        <w:spacing w:after="80"/>
       </w:pPr>
       <w:r>
         <w:rPr>
@@ -1749,7 +1745,7 @@
           <w:ilvl w:val="0"/>
           <w:numId w:val="1"/>
         </w:numPr>
-        <w:spacing w:after="100"/>
+        <w:spacing w:after="80"/>
       </w:pPr>
       <w:r>
         <w:rPr>
@@ -1766,7 +1762,7 @@
           <w:ilvl w:val="0"/>
           <w:numId w:val="1"/>
         </w:numPr>
-        <w:spacing w:after="100"/>
+        <w:spacing w:after="80"/>
       </w:pPr>
       <w:r>
         <w:rPr>
@@ -1779,7 +1775,7 @@
     <w:p>
       <w:pPr>
         <w:pStyle w:val="Heading1"/>
-        <w:spacing w:after="120" w:before="160"/>
+        <w:spacing w:after="120" w:before="180"/>
       </w:pPr>
       <w:r>
         <w:rPr>
@@ -1793,7 +1789,7 @@
     </w:p>
     <w:p>
       <w:pPr>
-        <w:spacing w:after="160"/>
+        <w:spacing w:after="120"/>
       </w:pPr>
       <w:r>
         <w:rPr>
@@ -1805,143 +1801,143 @@
     </w:p>
     <w:p>
       <w:pPr>
-        <w:spacing w:after="80"/>
+        <w:spacing w:after="60"/>
       </w:pPr>
       <w:r>
         <w:rPr>
           <w:rFonts w:ascii="Consolas" w:cs="Consolas" w:eastAsia="Consolas" w:hAnsi="Consolas"/>
-          <w:sz w:val="20"/>
-          <w:szCs w:val="20"/>
+          <w:sz w:val="19"/>
+          <w:szCs w:val="19"/>
         </w:rPr>
         <w:t xml:space="preserve">You are helping me continue a project named Sports Shop Platform.</w:t>
       </w:r>
     </w:p>
     <w:p>
       <w:pPr>
-        <w:spacing w:after="80"/>
+        <w:spacing w:after="60"/>
       </w:pPr>
       <w:r>
         <w:rPr>
           <w:rFonts w:ascii="Consolas" w:cs="Consolas" w:eastAsia="Consolas" w:hAnsi="Consolas"/>
-          <w:sz w:val="20"/>
-          <w:szCs w:val="20"/>
+          <w:sz w:val="19"/>
+          <w:szCs w:val="19"/>
         </w:rPr>
         <w:t xml:space="preserve">It is a full-stack Next.js 16 App Router + TypeScript + Prisma v7 + PostgreSQL multi-tenant sports retail SaaS.</w:t>
       </w:r>
     </w:p>
     <w:p>
       <w:pPr>
-        <w:spacing w:after="80"/>
+        <w:spacing w:after="60"/>
       </w:pPr>
       <w:r>
         <w:rPr>
           <w:rFonts w:ascii="Consolas" w:cs="Consolas" w:eastAsia="Consolas" w:hAnsi="Consolas"/>
-          <w:sz w:val="20"/>
-          <w:szCs w:val="20"/>
+          <w:sz w:val="19"/>
+          <w:szCs w:val="19"/>
         </w:rPr>
         <w:t xml:space="preserve">Read the repository first. Important files: prisma/schema.prisma, src/lib/db.ts, src/lib/auth.ts, src/lib/rbac.ts, src/proxy.ts, src/app/dashboard, src/app/admin, src/app/api, scripts/generate-docs.ts, railway.toml.</w:t>
       </w:r>
     </w:p>
     <w:p>
       <w:pPr>
-        <w:spacing w:after="80"/>
+        <w:spacing w:after="60"/>
       </w:pPr>
       <w:r>
         <w:rPr>
           <w:rFonts w:ascii="Consolas" w:cs="Consolas" w:eastAsia="Consolas" w:hAnsi="Consolas"/>
-          <w:sz w:val="20"/>
-          <w:szCs w:val="20"/>
+          <w:sz w:val="19"/>
+          <w:szCs w:val="19"/>
         </w:rPr>
         <w:t xml:space="preserve">Do not assume frontend and backend are separate. Server actions, route handlers, auth, and Prisma live inside the Next.js app.</w:t>
       </w:r>
     </w:p>
     <w:p>
       <w:pPr>
-        <w:spacing w:after="80"/>
+        <w:spacing w:after="60"/>
       </w:pPr>
       <w:r>
         <w:rPr>
           <w:rFonts w:ascii="Consolas" w:cs="Consolas" w:eastAsia="Consolas" w:hAnsi="Consolas"/>
-          <w:sz w:val="20"/>
-          <w:szCs w:val="20"/>
+          <w:sz w:val="19"/>
+          <w:szCs w:val="19"/>
         </w:rPr>
         <w:t xml:space="preserve">When changing database models, update prisma/schema.prisma and create a proper Prisma migration.</w:t>
       </w:r>
     </w:p>
     <w:p>
       <w:pPr>
-        <w:spacing w:after="80"/>
+        <w:spacing w:after="60"/>
       </w:pPr>
       <w:r>
         <w:rPr>
           <w:rFonts w:ascii="Consolas" w:cs="Consolas" w:eastAsia="Consolas" w:hAnsi="Consolas"/>
-          <w:sz w:val="20"/>
-          <w:szCs w:val="20"/>
+          <w:sz w:val="19"/>
+          <w:szCs w:val="19"/>
         </w:rPr>
         <w:t xml:space="preserve">Keep tenant isolation by always scoping tenant data with session.shopId.</w:t>
       </w:r>
     </w:p>
     <w:p>
       <w:pPr>
-        <w:spacing w:after="80"/>
+        <w:spacing w:after="60"/>
       </w:pPr>
       <w:r>
         <w:rPr>
           <w:rFonts w:ascii="Consolas" w:cs="Consolas" w:eastAsia="Consolas" w:hAnsi="Consolas"/>
-          <w:sz w:val="20"/>
-          <w:szCs w:val="20"/>
+          <w:sz w:val="19"/>
+          <w:szCs w:val="19"/>
         </w:rPr>
         <w:t xml:space="preserve">Keep role permissions consistent with src/lib/rbac.ts.</w:t>
       </w:r>
     </w:p>
     <w:p>
       <w:pPr>
-        <w:spacing w:after="80"/>
+        <w:spacing w:after="60"/>
       </w:pPr>
       <w:r>
         <w:rPr>
           <w:rFonts w:ascii="Consolas" w:cs="Consolas" w:eastAsia="Consolas" w:hAnsi="Consolas"/>
-          <w:sz w:val="20"/>
-          <w:szCs w:val="20"/>
+          <w:sz w:val="19"/>
+          <w:szCs w:val="19"/>
         </w:rPr>
         <w:t xml:space="preserve">Before finishing any change, run npm run lint, npm run test, npm run build, and npm audit --audit-level=moderate.</w:t>
       </w:r>
     </w:p>
     <w:p>
       <w:pPr>
-        <w:spacing w:after="80"/>
+        <w:spacing w:after="60"/>
       </w:pPr>
       <w:r>
         <w:rPr>
           <w:rFonts w:ascii="Consolas" w:cs="Consolas" w:eastAsia="Consolas" w:hAnsi="Consolas"/>
-          <w:sz w:val="20"/>
-          <w:szCs w:val="20"/>
+          <w:sz w:val="19"/>
+          <w:szCs w:val="19"/>
         </w:rPr>
         <w:t xml:space="preserve">My deployment target is Railway for the full-stack app and PostgreSQL first, with Cloudflare as DNS/proxy. Only split frontend to Cloudflare later if we refactor the backend into a separate API.</w:t>
       </w:r>
     </w:p>
     <w:p>
       <w:pPr>
-        <w:spacing w:after="80"/>
+        <w:spacing w:after="60"/>
       </w:pPr>
       <w:r>
         <w:rPr>
           <w:rFonts w:ascii="Consolas" w:cs="Consolas" w:eastAsia="Consolas" w:hAnsi="Consolas"/>
-          <w:sz w:val="20"/>
-          <w:szCs w:val="20"/>
+          <w:sz w:val="19"/>
+          <w:szCs w:val="19"/>
         </w:rPr>
         <w:t xml:space="preserve">Paystack uses one platform PAYSTACK_SECRET_KEY on the server. Each shop can store its own Paystack subaccount code and mobile money settlement details in Dashboard &gt; Settings.</w:t>
       </w:r>
     </w:p>
     <w:p>
       <w:pPr>
-        <w:spacing w:after="80"/>
+        <w:spacing w:after="60"/>
       </w:pPr>
       <w:r>
         <w:rPr>
           <w:rFonts w:ascii="Consolas" w:cs="Consolas" w:eastAsia="Consolas" w:hAnsi="Consolas"/>
-          <w:sz w:val="20"/>
-          <w:szCs w:val="20"/>
+          <w:sz w:val="19"/>
+          <w:szCs w:val="19"/>
         </w:rPr>
         <w:t xml:space="preserve">The design studio provides SVG, JSON job, and PLT exports. Exact direct cutter control requires confirming the shop's cutter model, driver, and connection protocol before adding a machine bridge.</w:t>
       </w:r>
@@ -1949,7 +1945,7 @@
     <w:p>
       <w:pPr>
         <w:pStyle w:val="Heading1"/>
-        <w:spacing w:after="120" w:before="160"/>
+        <w:spacing w:after="120" w:before="180"/>
       </w:pPr>
       <w:r>
         <w:rPr>
@@ -1968,7 +1964,41 @@
           <w:ilvl w:val="0"/>
           <w:numId w:val="1"/>
         </w:numPr>
-        <w:spacing w:after="100"/>
+        <w:spacing w:after="80"/>
+      </w:pPr>
+      <w:r>
+        <w:rPr>
+          <w:sz w:val="21"/>
+          <w:szCs w:val="21"/>
+        </w:rPr>
+        <w:t xml:space="preserve">Read docs/source/10_System_Diagnostic_Progress_and_Roadmap.md before starting new work. It contains the latest launch diagnostic, live route checks, known bugs, and the next implementation order.</w:t>
+      </w:r>
+    </w:p>
+    <w:p>
+      <w:pPr>
+        <w:pStyle w:val="ListParagraph"/>
+        <w:numPr>
+          <w:ilvl w:val="0"/>
+          <w:numId w:val="1"/>
+        </w:numPr>
+        <w:spacing w:after="80"/>
+      </w:pPr>
+      <w:r>
+        <w:rPr>
+          <w:sz w:val="21"/>
+          <w:szCs w:val="21"/>
+        </w:rPr>
+        <w:t xml:space="preserve">Launch blockers now include production demo seed safety, page-level dashboard RBAC, transaction-safe stock decrement, design undo/redo/delete, grouped templates, machine connection details, Paystack callback verification, and hardened buyer SMS registration.</w:t>
+      </w:r>
+    </w:p>
+    <w:p>
+      <w:pPr>
+        <w:pStyle w:val="ListParagraph"/>
+        <w:numPr>
+          <w:ilvl w:val="0"/>
+          <w:numId w:val="1"/>
+        </w:numPr>
+        <w:spacing w:after="80"/>
       </w:pPr>
       <w:r>
         <w:rPr>
@@ -1985,7 +2015,7 @@
           <w:ilvl w:val="0"/>
           <w:numId w:val="1"/>
         </w:numPr>
-        <w:spacing w:after="100"/>
+        <w:spacing w:after="80"/>
       </w:pPr>
       <w:r>
         <w:rPr>
@@ -2002,7 +2032,7 @@
           <w:ilvl w:val="0"/>
           <w:numId w:val="1"/>
         </w:numPr>
-        <w:spacing w:after="100"/>
+        <w:spacing w:after="80"/>
       </w:pPr>
       <w:r>
         <w:rPr>
@@ -2019,7 +2049,7 @@
           <w:ilvl w:val="0"/>
           <w:numId w:val="1"/>
         </w:numPr>
-        <w:spacing w:after="100"/>
+        <w:spacing w:after="80"/>
       </w:pPr>
       <w:r>
         <w:rPr>
@@ -2036,7 +2066,7 @@
           <w:ilvl w:val="0"/>
           <w:numId w:val="1"/>
         </w:numPr>
-        <w:spacing w:after="100"/>
+        <w:spacing w:after="80"/>
       </w:pPr>
       <w:r>
         <w:rPr>
@@ -2053,7 +2083,7 @@
           <w:ilvl w:val="0"/>
           <w:numId w:val="1"/>
         </w:numPr>
-        <w:spacing w:after="100"/>
+        <w:spacing w:after="80"/>
       </w:pPr>
       <w:r>
         <w:rPr>
@@ -2070,7 +2100,7 @@
           <w:ilvl w:val="0"/>
           <w:numId w:val="1"/>
         </w:numPr>
-        <w:spacing w:after="100"/>
+        <w:spacing w:after="80"/>
       </w:pPr>
       <w:r>
         <w:rPr>
@@ -2087,7 +2117,7 @@
           <w:ilvl w:val="0"/>
           <w:numId w:val="1"/>
         </w:numPr>
-        <w:spacing w:after="100"/>
+        <w:spacing w:after="80"/>
       </w:pPr>
       <w:r>
         <w:rPr>
@@ -2104,7 +2134,7 @@
           <w:ilvl w:val="0"/>
           <w:numId w:val="1"/>
         </w:numPr>
-        <w:spacing w:after="100"/>
+        <w:spacing w:after="80"/>
       </w:pPr>
       <w:r>
         <w:rPr>
@@ -2121,7 +2151,7 @@
           <w:ilvl w:val="0"/>
           <w:numId w:val="1"/>
         </w:numPr>
-        <w:spacing w:after="100"/>
+        <w:spacing w:after="80"/>
       </w:pPr>
       <w:r>
         <w:rPr>

</xml_diff>